<commit_message>
saving word meeting minutes again
</commit_message>
<xml_diff>
--- a/Meeting_Minutes(TemporarilyHere)/Meeting Minutes 13.02.25.docx
+++ b/Meeting_Minutes(TemporarilyHere)/Meeting Minutes 13.02.25.docx
@@ -53,6 +53,107 @@
       </w:pPr>
       <w:r>
         <w:t>If this small of a tolerance is okay</w:t>
+      </w:r>
+    </w:p>
+    <w:p>
+      <w:pPr>
+        <w:pStyle w:val="ListParagraph"/>
+        <w:numPr>
+          <w:ilvl w:val="0"/>
+          <w:numId w:val="1"/>
+        </w:numPr>
+      </w:pPr>
+      <w:r>
+        <w:t>For some reason on Altium PCB when I copy room format, it does not change the shape of the room as well</w:t>
+      </w:r>
+    </w:p>
+    <w:p>
+      <w:pPr>
+        <w:pStyle w:val="ListParagraph"/>
+        <w:numPr>
+          <w:ilvl w:val="0"/>
+          <w:numId w:val="1"/>
+        </w:numPr>
+      </w:pPr>
+      <w:r>
+        <w:t>Do we really want the Ethernet cable jack to be coming out of the board like that or should it be also in the direction of the receiver/transmitters</w:t>
+      </w:r>
+    </w:p>
+    <w:p>
+      <w:pPr>
+        <w:pStyle w:val="ListParagraph"/>
+        <w:numPr>
+          <w:ilvl w:val="0"/>
+          <w:numId w:val="1"/>
+        </w:numPr>
+      </w:pPr>
+      <w:r>
+        <w:t>To make sure all the 10k resistors are the same – I also used the 0.1% 10k resistors for the receiver and transmitter – is this okay?</w:t>
+      </w:r>
+    </w:p>
+    <w:p>
+      <w:pPr>
+        <w:pStyle w:val="ListParagraph"/>
+        <w:numPr>
+          <w:ilvl w:val="0"/>
+          <w:numId w:val="1"/>
+        </w:numPr>
+      </w:pPr>
+      <w:r>
+        <w:t>For the Designators for transmitters &amp; receivers, is it okay if I just have them once for ex. The 1</w:t>
+      </w:r>
+      <w:r>
+        <w:rPr>
+          <w:vertAlign w:val="superscript"/>
+        </w:rPr>
+        <w:t>st</w:t>
+      </w:r>
+      <w:r>
+        <w:t xml:space="preserve"> one and then delete the rest?</w:t>
+      </w:r>
+    </w:p>
+    <w:p>
+      <w:pPr>
+        <w:pStyle w:val="ListParagraph"/>
+        <w:numPr>
+          <w:ilvl w:val="0"/>
+          <w:numId w:val="1"/>
+        </w:numPr>
+      </w:pPr>
+      <w:r>
+        <w:t>PLS help with the branches on source tree</w:t>
+      </w:r>
+    </w:p>
+    <w:p>
+      <w:pPr>
+        <w:pStyle w:val="ListParagraph"/>
+        <w:numPr>
+          <w:ilvl w:val="0"/>
+          <w:numId w:val="1"/>
+        </w:numPr>
+      </w:pPr>
+      <w:r>
+        <w:t xml:space="preserve">Mechanical </w:t>
+      </w:r>
+      <w:proofErr w:type="spellStart"/>
+      <w:r>
+        <w:t>befestigung</w:t>
+      </w:r>
+      <w:proofErr w:type="spellEnd"/>
+      <w:r>
+        <w:t xml:space="preserve"> of the board</w:t>
+      </w:r>
+    </w:p>
+    <w:p>
+      <w:pPr>
+        <w:pStyle w:val="ListParagraph"/>
+        <w:numPr>
+          <w:ilvl w:val="0"/>
+          <w:numId w:val="1"/>
+        </w:numPr>
+      </w:pPr>
+      <w:r>
+        <w:t>Presentation</w:t>
       </w:r>
     </w:p>
     <w:sectPr>

</xml_diff>

<commit_message>
Meeting with Eyke - changes made
</commit_message>
<xml_diff>
--- a/Meeting_Minutes(TemporarilyHere)/Meeting Minutes 13.02.25.docx
+++ b/Meeting_Minutes(TemporarilyHere)/Meeting Minutes 13.02.25.docx
@@ -18,6 +18,18 @@
       <w:r>
         <w:t>Is the resistor sizes okay in the power schematics?</w:t>
       </w:r>
+      <w:r>
+        <w:rPr>
+          <w:rFonts w:ascii="Segoe UI Emoji" w:hAnsi="Segoe UI Emoji" w:cs="Calibri"/>
+        </w:rPr>
+        <w:t xml:space="preserve"> </w:t>
+      </w:r>
+      <w:r>
+        <w:rPr>
+          <w:rFonts w:ascii="Segoe UI Emoji" w:hAnsi="Segoe UI Emoji" w:cs="Segoe UI Emoji"/>
+        </w:rPr>
+        <w:t>✅</w:t>
+      </w:r>
     </w:p>
     <w:p>
       <w:pPr>
@@ -78,6 +90,27 @@
       <w:r>
         <w:t>Do we really want the Ethernet cable jack to be coming out of the board like that or should it be also in the direction of the receiver/transmitters</w:t>
       </w:r>
+      <w:r>
+        <w:rPr>
+          <w:rFonts w:ascii="Segoe UI Emoji" w:hAnsi="Segoe UI Emoji" w:cs="Segoe UI Emoji"/>
+        </w:rPr>
+        <w:t>✅</w:t>
+      </w:r>
+    </w:p>
+    <w:p>
+      <w:pPr>
+        <w:pStyle w:val="ListParagraph"/>
+        <w:numPr>
+          <w:ilvl w:val="1"/>
+          <w:numId w:val="1"/>
+        </w:numPr>
+      </w:pPr>
+      <w:r>
+        <w:rPr>
+          <w:rFonts w:ascii="Segoe UI Emoji" w:hAnsi="Segoe UI Emoji" w:cs="Segoe UI Emoji"/>
+        </w:rPr>
+        <w:t>From Kaan’s board</w:t>
+      </w:r>
     </w:p>
     <w:p>
       <w:pPr>
@@ -90,6 +123,18 @@
       <w:r>
         <w:t>To make sure all the 10k resistors are the same – I also used the 0.1% 10k resistors for the receiver and transmitter – is this okay?</w:t>
       </w:r>
+      <w:r>
+        <w:rPr>
+          <w:rFonts w:ascii="Segoe UI Emoji" w:hAnsi="Segoe UI Emoji" w:cs="Segoe UI Emoji"/>
+        </w:rPr>
+        <w:t xml:space="preserve"> </w:t>
+      </w:r>
+      <w:r>
+        <w:rPr>
+          <w:rFonts w:ascii="Segoe UI Emoji" w:hAnsi="Segoe UI Emoji" w:cs="Segoe UI Emoji"/>
+        </w:rPr>
+        <w:t>✅</w:t>
+      </w:r>
     </w:p>
     <w:p>
       <w:pPr>
@@ -111,6 +156,18 @@
       <w:r>
         <w:t xml:space="preserve"> one and then delete the rest?</w:t>
       </w:r>
+      <w:r>
+        <w:rPr>
+          <w:rFonts w:ascii="Segoe UI Emoji" w:hAnsi="Segoe UI Emoji" w:cs="Segoe UI Emoji"/>
+        </w:rPr>
+        <w:t xml:space="preserve"> </w:t>
+      </w:r>
+      <w:r>
+        <w:rPr>
+          <w:rFonts w:ascii="Segoe UI Emoji" w:hAnsi="Segoe UI Emoji" w:cs="Segoe UI Emoji"/>
+        </w:rPr>
+        <w:t>✅</w:t>
+      </w:r>
     </w:p>
     <w:p>
       <w:pPr>
@@ -123,6 +180,12 @@
       <w:r>
         <w:t>PLS help with the branches on source tree</w:t>
       </w:r>
+      <w:r>
+        <w:rPr>
+          <w:rFonts w:ascii="Segoe UI Emoji" w:hAnsi="Segoe UI Emoji" w:cs="Segoe UI Emoji"/>
+        </w:rPr>
+        <w:t>✅</w:t>
+      </w:r>
     </w:p>
     <w:p>
       <w:pPr>
@@ -148,12 +211,72 @@
       <w:pPr>
         <w:pStyle w:val="ListParagraph"/>
         <w:numPr>
+          <w:ilvl w:val="1"/>
+          <w:numId w:val="1"/>
+        </w:numPr>
+      </w:pPr>
+      <w:r>
+        <w:t>Check on assembly</w:t>
+      </w:r>
+    </w:p>
+    <w:p>
+      <w:pPr>
+        <w:pStyle w:val="ListParagraph"/>
+        <w:numPr>
           <w:ilvl w:val="0"/>
           <w:numId w:val="1"/>
         </w:numPr>
       </w:pPr>
       <w:r>
         <w:t>Presentation</w:t>
+      </w:r>
+    </w:p>
+    <w:p/>
+    <w:p/>
+    <w:p>
+      <w:proofErr w:type="spellStart"/>
+      <w:r>
+        <w:t>Reeiver</w:t>
+      </w:r>
+      <w:proofErr w:type="spellEnd"/>
+      <w:r>
+        <w:t>/Transmitters;</w:t>
+      </w:r>
+    </w:p>
+    <w:p>
+      <w:pPr>
+        <w:pStyle w:val="ListParagraph"/>
+        <w:numPr>
+          <w:ilvl w:val="0"/>
+          <w:numId w:val="1"/>
+        </w:numPr>
+      </w:pPr>
+      <w:r>
+        <w:t>We need to know which signals are where – like PWM_U or something</w:t>
+      </w:r>
+    </w:p>
+    <w:p>
+      <w:pPr>
+        <w:pStyle w:val="ListParagraph"/>
+        <w:numPr>
+          <w:ilvl w:val="0"/>
+          <w:numId w:val="1"/>
+        </w:numPr>
+      </w:pPr>
+      <w:r>
+        <w:t>Descriptions for all the connectors top and bottom</w:t>
+      </w:r>
+    </w:p>
+    <w:p>
+      <w:pPr>
+        <w:pStyle w:val="ListParagraph"/>
+        <w:numPr>
+          <w:ilvl w:val="0"/>
+          <w:numId w:val="1"/>
+        </w:numPr>
+      </w:pPr>
+      <w:r>
+        <w:t>It is also okay just to have once designators and ten group everything into silk screens</w:t>
       </w:r>
     </w:p>
     <w:sectPr>
@@ -890,7 +1013,6 @@
   <w:style w:type="character" w:default="1" w:styleId="DefaultParagraphFont">
     <w:name w:val="Default Paragraph Font"/>
     <w:uiPriority w:val="1"/>
-    <w:semiHidden/>
     <w:unhideWhenUsed/>
   </w:style>
   <w:style w:type="table" w:default="1" w:styleId="TableNormal">

</xml_diff>